<commit_message>
Fix Bingo Night round count from 10 to 9 rounds
</commit_message>
<xml_diff>
--- a/playbook/editable/4-EVERY-WEEK.docx
+++ b/playbook/editable/4-EVERY-WEEK.docx
@@ -271,6 +271,44 @@
     <w:p>
       <w:r>
         <w:t>Reels are not part of this. We film those ourselves.</w:t>
+      </w:r>
+    </w:p>
+    <w:p>
+      <w:r>
+        <w:rPr>
+          <w:b/>
+        </w:rPr>
+        <w:t>Got a big event coming up?</w:t>
+      </w:r>
+      <w:r>
+        <w:t xml:space="preserve"> Tell Claude once and it handles the whole build-up. Something like:</w:t>
+      </w:r>
+    </w:p>
+    <w:p>
+      <w:pPr>
+        <w:pStyle w:val="IntenseQuote"/>
+      </w:pPr>
+      <w:r>
+        <w:t>Our 2 year anniversary party is Saturday August 22. Start promoting it now.</w:t>
+      </w:r>
+    </w:p>
+    <w:p>
+      <w:r>
+        <w:t>From then on, every Sunday until the event, the posts ramp automatically. Three weeks out it just announces the date. Two weeks out it starts revealing things one at a time. The last week it counts down. You do not have to remember where in the build-up you are.</w:t>
+      </w:r>
+    </w:p>
+    <w:p>
+      <w:r>
+        <w:t xml:space="preserve">It will also hand you a short </w:t>
+      </w:r>
+      <w:r>
+        <w:rPr>
+          <w:b/>
+        </w:rPr>
+        <w:t>off the feed</w:t>
+      </w:r>
+      <w:r>
+        <w:t xml:space="preserve"> list at the end each week: make the Facebook Event, which groups to share it in, who to ask to reshare it. Do those. They are usually worth more than the posts.</w:t>
       </w:r>
     </w:p>
     <w:p>

</xml_diff>